<commit_message>
Add expanded Swagger screenshots and update Word doc
</commit_message>
<xml_diff>
--- a/QA_Automation_Documentation.docx
+++ b/QA_Automation_Documentation.docx
@@ -2719,7 +2719,7 @@
           <w:color w:val="06B6D4"/>
           <w:sz w:val="28"/>
         </w:rPr>
-        <w:t>Screenshot 10: Swagger-style API Testing Report</w:t>
+        <w:t>Screenshot 10: Swagger-style API Testing Report (Collapsed Overview)</w:t>
       </w:r>
     </w:p>
     <w:p>
@@ -2774,7 +2774,7 @@
           <w:color w:val="94A3B8"/>
           <w:sz w:val="19"/>
         </w:rPr>
-        <w:t>Displays the interactive Swagger-style HTML test report documenting the API testing scenarios, request payloads, response bodies, and validation execution outcomes.</w:t>
+        <w:t>Displays the interactive Swagger-style HTML test report collapsed landing page.</w:t>
       </w:r>
     </w:p>
     <w:p>
@@ -2789,7 +2789,147 @@
           <w:color w:val="06B6D4"/>
           <w:sz w:val="28"/>
         </w:rPr>
-        <w:t>Screenshot 11: Pushed GitHub Repository</w:t>
+        <w:t>Screenshot 11: Swagger-style API Testing Report (POST Expanded)</w:t>
+      </w:r>
+    </w:p>
+    <w:p>
+      <w:pPr>
+        <w:spacing w:before="160" w:after="80"/>
+        <w:jc w:val="center"/>
+      </w:pPr>
+      <w:r>
+        <w:drawing>
+          <wp:inline xmlns:a="http://schemas.openxmlformats.org/drawingml/2006/main" xmlns:pic="http://schemas.openxmlformats.org/drawingml/2006/picture">
+            <wp:extent cx="5120640" cy="2744585"/>
+            <wp:docPr id="12" name="Picture 12"/>
+            <wp:cNvGraphicFramePr>
+              <a:graphicFrameLocks noChangeAspect="1"/>
+            </wp:cNvGraphicFramePr>
+            <a:graphic>
+              <a:graphicData uri="http://schemas.openxmlformats.org/drawingml/2006/picture">
+                <pic:pic>
+                  <pic:nvPicPr>
+                    <pic:cNvPr id="0" name="api_swagger_post_expanded.png"/>
+                    <pic:cNvPicPr/>
+                  </pic:nvPicPr>
+                  <pic:blipFill>
+                    <a:blip r:embed="rId20"/>
+                    <a:stretch>
+                      <a:fillRect/>
+                    </a:stretch>
+                  </pic:blipFill>
+                  <pic:spPr>
+                    <a:xfrm>
+                      <a:off x="0" y="0"/>
+                      <a:ext cx="5120640" cy="2744585"/>
+                    </a:xfrm>
+                    <a:prstGeom prst="rect"/>
+                  </pic:spPr>
+                </pic:pic>
+              </a:graphicData>
+            </a:graphic>
+          </wp:inline>
+        </w:drawing>
+      </w:r>
+    </w:p>
+    <w:p>
+      <w:pPr>
+        <w:spacing w:after="360"/>
+        <w:jc w:val="center"/>
+      </w:pPr>
+      <w:r>
+        <w:rPr>
+          <w:rFonts w:ascii="Segoe UI" w:hAnsi="Segoe UI"/>
+          <w:i/>
+          <w:color w:val="94A3B8"/>
+          <w:sz w:val="19"/>
+        </w:rPr>
+        <w:t>Displays the expanded POST /api/v1/employees endpoint details including schema and positive/negative test execution logs.</w:t>
+      </w:r>
+    </w:p>
+    <w:p>
+      <w:pPr>
+        <w:keepNext/>
+        <w:spacing w:before="320" w:after="120"/>
+      </w:pPr>
+      <w:r>
+        <w:rPr>
+          <w:rFonts w:ascii="Segoe UI" w:hAnsi="Segoe UI"/>
+          <w:b/>
+          <w:color w:val="06B6D4"/>
+          <w:sz w:val="28"/>
+        </w:rPr>
+        <w:t>Screenshot 12: Swagger-style API Testing Report (GET Expanded)</w:t>
+      </w:r>
+    </w:p>
+    <w:p>
+      <w:pPr>
+        <w:spacing w:before="160" w:after="80"/>
+        <w:jc w:val="center"/>
+      </w:pPr>
+      <w:r>
+        <w:drawing>
+          <wp:inline xmlns:a="http://schemas.openxmlformats.org/drawingml/2006/main" xmlns:pic="http://schemas.openxmlformats.org/drawingml/2006/picture">
+            <wp:extent cx="5120640" cy="2744585"/>
+            <wp:docPr id="13" name="Picture 13"/>
+            <wp:cNvGraphicFramePr>
+              <a:graphicFrameLocks noChangeAspect="1"/>
+            </wp:cNvGraphicFramePr>
+            <a:graphic>
+              <a:graphicData uri="http://schemas.openxmlformats.org/drawingml/2006/picture">
+                <pic:pic>
+                  <pic:nvPicPr>
+                    <pic:cNvPr id="0" name="api_swagger_get_expanded.png"/>
+                    <pic:cNvPicPr/>
+                  </pic:nvPicPr>
+                  <pic:blipFill>
+                    <a:blip r:embed="rId21"/>
+                    <a:stretch>
+                      <a:fillRect/>
+                    </a:stretch>
+                  </pic:blipFill>
+                  <pic:spPr>
+                    <a:xfrm>
+                      <a:off x="0" y="0"/>
+                      <a:ext cx="5120640" cy="2744585"/>
+                    </a:xfrm>
+                    <a:prstGeom prst="rect"/>
+                  </pic:spPr>
+                </pic:pic>
+              </a:graphicData>
+            </a:graphic>
+          </wp:inline>
+        </w:drawing>
+      </w:r>
+    </w:p>
+    <w:p>
+      <w:pPr>
+        <w:spacing w:after="360"/>
+        <w:jc w:val="center"/>
+      </w:pPr>
+      <w:r>
+        <w:rPr>
+          <w:rFonts w:ascii="Segoe UI" w:hAnsi="Segoe UI"/>
+          <w:i/>
+          <w:color w:val="94A3B8"/>
+          <w:sz w:val="19"/>
+        </w:rPr>
+        <w:t>Displays the expanded GET /api/v1/employees/{id} endpoint details including parameter tables and positive/negative test execution logs.</w:t>
+      </w:r>
+    </w:p>
+    <w:p>
+      <w:pPr>
+        <w:keepNext/>
+        <w:spacing w:before="320" w:after="120"/>
+      </w:pPr>
+      <w:r>
+        <w:rPr>
+          <w:rFonts w:ascii="Segoe UI" w:hAnsi="Segoe UI"/>
+          <w:b/>
+          <w:color w:val="06B6D4"/>
+          <w:sz w:val="28"/>
+        </w:rPr>
+        <w:t>Screenshot 13: Pushed GitHub Repository</w:t>
       </w:r>
     </w:p>
     <w:p>
@@ -2801,7 +2941,7 @@
         <w:drawing>
           <wp:inline xmlns:a="http://schemas.openxmlformats.org/drawingml/2006/main" xmlns:pic="http://schemas.openxmlformats.org/drawingml/2006/picture">
             <wp:extent cx="5120640" cy="2498464"/>
-            <wp:docPr id="12" name="Picture 12"/>
+            <wp:docPr id="14" name="Picture 14"/>
             <wp:cNvGraphicFramePr>
               <a:graphicFrameLocks noChangeAspect="1"/>
             </wp:cNvGraphicFramePr>
@@ -2813,7 +2953,7 @@
                     <pic:cNvPicPr/>
                   </pic:nvPicPr>
                   <pic:blipFill>
-                    <a:blip r:embed="rId20"/>
+                    <a:blip r:embed="rId22"/>
                     <a:stretch>
                       <a:fillRect/>
                     </a:stretch>

</xml_diff>